<commit_message>
docs(tv2): update execution plan, setup guide, prompts and progress reports
</commit_message>
<xml_diff>
--- a/docs/competition/DSC2026_Task1_LegalIR_Data_Overview.docx
+++ b/docs/competition/DSC2026_Task1_LegalIR_Data_Overview.docx
@@ -2486,12 +2486,12 @@
           <wp:inline distB="114300" distT="114300" distL="114300" distR="114300">
             <wp:extent cx="2006600" cy="330200"/>
             <wp:effectExtent b="0" l="0" r="0" t="0"/>
-            <wp:docPr id="6" name="image4.gif"/>
+            <wp:docPr id="6" name="image3.gif"/>
             <a:graphic>
               <a:graphicData uri="http://schemas.openxmlformats.org/drawingml/2006/picture">
                 <pic:pic>
                   <pic:nvPicPr>
-                    <pic:cNvPr id="0" name="image4.gif"/>
+                    <pic:cNvPr id="0" name="image3.gif"/>
                     <pic:cNvPicPr preferRelativeResize="0"/>
                   </pic:nvPicPr>
                   <pic:blipFill>
@@ -2574,7 +2574,558 @@
           <wp:inline distB="114300" distT="114300" distL="114300" distR="114300">
             <wp:extent cx="558800" cy="177800"/>
             <wp:effectExtent b="0" l="0" r="0" t="0"/>
-            <wp:docPr id="10" name="image9.gif"/>
+            <wp:docPr id="10" name="image7.gif"/>
+            <a:graphic>
+              <a:graphicData uri="http://schemas.openxmlformats.org/drawingml/2006/picture">
+                <pic:pic>
+                  <pic:nvPicPr>
+                    <pic:cNvPr id="0" name="image7.gif"/>
+                    <pic:cNvPicPr preferRelativeResize="0"/>
+                  </pic:nvPicPr>
+                  <pic:blipFill>
+                    <a:blip r:embed="rId8"/>
+                    <a:srcRect b="0" l="0" r="0" t="0"/>
+                    <a:stretch>
+                      <a:fillRect/>
+                    </a:stretch>
+                  </pic:blipFill>
+                  <pic:spPr>
+                    <a:xfrm>
+                      <a:off x="0" y="0"/>
+                      <a:ext cx="558800" cy="177800"/>
+                    </a:xfrm>
+                    <a:prstGeom prst="rect"/>
+                    <a:ln/>
+                  </pic:spPr>
+                </pic:pic>
+              </a:graphicData>
+            </a:graphic>
+          </wp:inline>
+        </w:drawing>
+      </w:r>
+      <w:r>
+        <w:rPr>
+          <w:rFonts w:ascii="Cambria" w:cs="Cambria" w:eastAsia="Cambria" w:hAnsi="Cambria"/>
+          <w:color w:val="000000"/>
+          <w:sz w:val="22"/>
+          <w:szCs w:val="22"/>
+          <w:rtl w:val="0"/>
+        </w:rPr>
+        <w:t xml:space="preserve"> là tập các document_id đúng của câu hỏi thứ </w:t>
+      </w:r>
+      <w:r>
+        <w:rPr>
+          <w:rFonts w:ascii="Cambria" w:cs="Cambria" w:eastAsia="Cambria" w:hAnsi="Cambria"/>
+          <w:color w:val="000000"/>
+          <w:sz w:val="22"/>
+          <w:szCs w:val="22"/>
+        </w:rPr>
+        <w:drawing>
+          <wp:inline distB="114300" distT="114300" distL="114300" distR="114300">
+            <wp:extent cx="50800" cy="177800"/>
+            <wp:effectExtent b="0" l="0" r="0" t="0"/>
+            <wp:docPr id="9" name="image6.gif"/>
+            <a:graphic>
+              <a:graphicData uri="http://schemas.openxmlformats.org/drawingml/2006/picture">
+                <pic:pic>
+                  <pic:nvPicPr>
+                    <pic:cNvPr id="0" name="image6.gif"/>
+                    <pic:cNvPicPr preferRelativeResize="0"/>
+                  </pic:nvPicPr>
+                  <pic:blipFill>
+                    <a:blip r:embed="rId9"/>
+                    <a:srcRect b="0" l="0" r="0" t="0"/>
+                    <a:stretch>
+                      <a:fillRect/>
+                    </a:stretch>
+                  </pic:blipFill>
+                  <pic:spPr>
+                    <a:xfrm>
+                      <a:off x="0" y="0"/>
+                      <a:ext cx="50800" cy="177800"/>
+                    </a:xfrm>
+                    <a:prstGeom prst="rect"/>
+                    <a:ln/>
+                  </pic:spPr>
+                </pic:pic>
+              </a:graphicData>
+            </a:graphic>
+          </wp:inline>
+        </w:drawing>
+      </w:r>
+      <w:r>
+        <w:rPr>
+          <w:rFonts w:ascii="Cambria" w:cs="Cambria" w:eastAsia="Cambria" w:hAnsi="Cambria"/>
+          <w:color w:val="000000"/>
+          <w:sz w:val="22"/>
+          <w:szCs w:val="22"/>
+          <w:rtl w:val="0"/>
+        </w:rPr>
+        <w:t xml:space="preserve">.</w:t>
+      </w:r>
+    </w:p>
+    <w:p>
+      <w:pPr>
+        <w:numPr>
+          <w:ilvl w:val="0"/>
+          <w:numId w:val="1"/>
+        </w:numPr>
+        <w:spacing w:after="0" w:line="240" w:lineRule="auto"/>
+        <w:ind w:left="720" w:hanging="360"/>
+        <w:rPr>
+          <w:rFonts w:ascii="Cambria" w:cs="Cambria" w:eastAsia="Cambria" w:hAnsi="Cambria"/>
+          <w:color w:val="000000"/>
+          <w:sz w:val="22"/>
+          <w:szCs w:val="22"/>
+        </w:rPr>
+      </w:pPr>
+      <w:r>
+        <w:rPr>
+          <w:rFonts w:ascii="Cambria" w:cs="Cambria" w:eastAsia="Cambria" w:hAnsi="Cambria"/>
+          <w:color w:val="000000"/>
+          <w:sz w:val="22"/>
+          <w:szCs w:val="22"/>
+        </w:rPr>
+        <w:drawing>
+          <wp:inline distB="114300" distT="114300" distL="114300" distR="114300">
+            <wp:extent cx="596900" cy="177800"/>
+            <wp:effectExtent b="0" l="0" r="0" t="0"/>
+            <wp:docPr id="4" name="image5.gif"/>
+            <a:graphic>
+              <a:graphicData uri="http://schemas.openxmlformats.org/drawingml/2006/picture">
+                <pic:pic>
+                  <pic:nvPicPr>
+                    <pic:cNvPr id="0" name="image5.gif"/>
+                    <pic:cNvPicPr preferRelativeResize="0"/>
+                  </pic:nvPicPr>
+                  <pic:blipFill>
+                    <a:blip r:embed="rId10"/>
+                    <a:srcRect b="0" l="0" r="0" t="0"/>
+                    <a:stretch>
+                      <a:fillRect/>
+                    </a:stretch>
+                  </pic:blipFill>
+                  <pic:spPr>
+                    <a:xfrm>
+                      <a:off x="0" y="0"/>
+                      <a:ext cx="596900" cy="177800"/>
+                    </a:xfrm>
+                    <a:prstGeom prst="rect"/>
+                    <a:ln/>
+                  </pic:spPr>
+                </pic:pic>
+              </a:graphicData>
+            </a:graphic>
+          </wp:inline>
+        </w:drawing>
+      </w:r>
+      <w:r>
+        <w:rPr>
+          <w:rFonts w:ascii="Cambria" w:cs="Cambria" w:eastAsia="Cambria" w:hAnsi="Cambria"/>
+          <w:color w:val="000000"/>
+          <w:sz w:val="22"/>
+          <w:szCs w:val="22"/>
+          <w:rtl w:val="0"/>
+        </w:rPr>
+        <w:t xml:space="preserve"> là tập các document_id mà hệ thống trả về.</w:t>
+      </w:r>
+    </w:p>
+    <w:p>
+      <w:pPr>
+        <w:spacing w:line="240" w:lineRule="auto"/>
+        <w:rPr>
+          <w:rFonts w:ascii="Cambria" w:cs="Cambria" w:eastAsia="Cambria" w:hAnsi="Cambria"/>
+          <w:color w:val="000000"/>
+          <w:sz w:val="22"/>
+          <w:szCs w:val="22"/>
+        </w:rPr>
+      </w:pPr>
+      <w:r>
+        <w:rPr>
+          <w:rFonts w:ascii="Cambria" w:cs="Cambria" w:eastAsia="Cambria" w:hAnsi="Cambria"/>
+          <w:color w:val="000000"/>
+          <w:sz w:val="22"/>
+          <w:szCs w:val="22"/>
+          <w:rtl w:val="0"/>
+        </w:rPr>
+        <w:t xml:space="preserve">Điểm Recall cuối cùng được tính bằng trung bình trên toàn bộ câu hỏi:</w:t>
+      </w:r>
+    </w:p>
+    <w:p>
+      <w:pPr>
+        <w:spacing w:line="240" w:lineRule="auto"/>
+        <w:rPr>
+          <w:rFonts w:ascii="Cambria" w:cs="Cambria" w:eastAsia="Cambria" w:hAnsi="Cambria"/>
+          <w:color w:val="000000"/>
+          <w:sz w:val="22"/>
+          <w:szCs w:val="22"/>
+        </w:rPr>
+      </w:pPr>
+      <w:r>
+        <w:rPr>
+          <w:rFonts w:ascii="Cambria" w:cs="Cambria" w:eastAsia="Cambria" w:hAnsi="Cambria"/>
+          <w:color w:val="000000"/>
+          <w:sz w:val="22"/>
+          <w:szCs w:val="22"/>
+        </w:rPr>
+        <w:drawing>
+          <wp:inline distB="114300" distT="114300" distL="114300" distR="114300">
+            <wp:extent cx="1244600" cy="444500"/>
+            <wp:effectExtent b="0" l="0" r="0" t="0"/>
+            <wp:docPr id="3" name="image8.gif"/>
+            <a:graphic>
+              <a:graphicData uri="http://schemas.openxmlformats.org/drawingml/2006/picture">
+                <pic:pic>
+                  <pic:nvPicPr>
+                    <pic:cNvPr id="0" name="image8.gif"/>
+                    <pic:cNvPicPr preferRelativeResize="0"/>
+                  </pic:nvPicPr>
+                  <pic:blipFill>
+                    <a:blip r:embed="rId11"/>
+                    <a:srcRect b="0" l="0" r="0" t="0"/>
+                    <a:stretch>
+                      <a:fillRect/>
+                    </a:stretch>
+                  </pic:blipFill>
+                  <pic:spPr>
+                    <a:xfrm>
+                      <a:off x="0" y="0"/>
+                      <a:ext cx="1244600" cy="444500"/>
+                    </a:xfrm>
+                    <a:prstGeom prst="rect"/>
+                    <a:ln/>
+                  </pic:spPr>
+                </pic:pic>
+              </a:graphicData>
+            </a:graphic>
+          </wp:inline>
+        </w:drawing>
+      </w:r>
+      <w:r>
+        <w:rPr>
+          <w:rFonts w:ascii="Cambria" w:cs="Cambria" w:eastAsia="Cambria" w:hAnsi="Cambria"/>
+          <w:color w:val="000000"/>
+          <w:sz w:val="22"/>
+          <w:szCs w:val="22"/>
+          <w:rtl w:val="0"/>
+        </w:rPr>
+        <w:br w:type="textWrapping"/>
+        <w:br w:type="textWrapping"/>
+      </w:r>
+    </w:p>
+    <w:p>
+      <w:pPr>
+        <w:spacing w:line="240" w:lineRule="auto"/>
+        <w:rPr>
+          <w:rFonts w:ascii="Cambria" w:cs="Cambria" w:eastAsia="Cambria" w:hAnsi="Cambria"/>
+          <w:color w:val="000000"/>
+          <w:sz w:val="22"/>
+          <w:szCs w:val="22"/>
+        </w:rPr>
+      </w:pPr>
+      <w:r>
+        <w:rPr>
+          <w:rFonts w:ascii="Cambria" w:cs="Cambria" w:eastAsia="Cambria" w:hAnsi="Cambria"/>
+          <w:color w:val="000000"/>
+          <w:sz w:val="22"/>
+          <w:szCs w:val="22"/>
+          <w:rtl w:val="0"/>
+        </w:rPr>
+        <w:t xml:space="preserve">Trong đó </w:t>
+      </w:r>
+      <w:r>
+        <w:rPr>
+          <w:rFonts w:ascii="Cambria" w:cs="Cambria" w:eastAsia="Cambria" w:hAnsi="Cambria"/>
+          <w:color w:val="000000"/>
+          <w:sz w:val="22"/>
+          <w:szCs w:val="22"/>
+        </w:rPr>
+        <w:drawing>
+          <wp:inline distB="114300" distT="114300" distL="114300" distR="114300">
+            <wp:extent cx="101600" cy="177800"/>
+            <wp:effectExtent b="0" l="0" r="0" t="0"/>
+            <wp:docPr id="8" name="image2.gif"/>
+            <a:graphic>
+              <a:graphicData uri="http://schemas.openxmlformats.org/drawingml/2006/picture">
+                <pic:pic>
+                  <pic:nvPicPr>
+                    <pic:cNvPr id="0" name="image2.gif"/>
+                    <pic:cNvPicPr preferRelativeResize="0"/>
+                  </pic:nvPicPr>
+                  <pic:blipFill>
+                    <a:blip r:embed="rId12"/>
+                    <a:srcRect b="0" l="0" r="0" t="0"/>
+                    <a:stretch>
+                      <a:fillRect/>
+                    </a:stretch>
+                  </pic:blipFill>
+                  <pic:spPr>
+                    <a:xfrm>
+                      <a:off x="0" y="0"/>
+                      <a:ext cx="101600" cy="177800"/>
+                    </a:xfrm>
+                    <a:prstGeom prst="rect"/>
+                    <a:ln/>
+                  </pic:spPr>
+                </pic:pic>
+              </a:graphicData>
+            </a:graphic>
+          </wp:inline>
+        </w:drawing>
+      </w:r>
+      <w:r>
+        <w:rPr>
+          <w:rFonts w:ascii="Cambria" w:cs="Cambria" w:eastAsia="Cambria" w:hAnsi="Cambria"/>
+          <w:color w:val="000000"/>
+          <w:sz w:val="22"/>
+          <w:szCs w:val="22"/>
+          <w:rtl w:val="0"/>
+        </w:rPr>
+        <w:t xml:space="preserve"> là tổng số câu hỏi.</w:t>
+      </w:r>
+    </w:p>
+    <w:p>
+      <w:pPr>
+        <w:spacing w:line="240" w:lineRule="auto"/>
+        <w:rPr>
+          <w:rFonts w:ascii="Cambria" w:cs="Cambria" w:eastAsia="Cambria" w:hAnsi="Cambria"/>
+          <w:color w:val="000000"/>
+          <w:sz w:val="22"/>
+          <w:szCs w:val="22"/>
+        </w:rPr>
+      </w:pPr>
+      <w:r>
+        <w:rPr>
+          <w:rFonts w:ascii="Cambria" w:cs="Cambria" w:eastAsia="Cambria" w:hAnsi="Cambria"/>
+          <w:color w:val="000000"/>
+          <w:sz w:val="22"/>
+          <w:szCs w:val="22"/>
+          <w:rtl w:val="0"/>
+        </w:rPr>
+        <w:t xml:space="preserve">Recall có giá trị trong khoảng </w:t>
+      </w:r>
+      <w:r>
+        <w:rPr>
+          <w:rFonts w:ascii="Cambria" w:cs="Cambria" w:eastAsia="Cambria" w:hAnsi="Cambria"/>
+          <w:b w:val="1"/>
+          <w:bCs w:val="1"/>
+          <w:color w:val="000000"/>
+          <w:sz w:val="22"/>
+          <w:szCs w:val="22"/>
+          <w:rtl w:val="0"/>
+        </w:rPr>
+        <w:t xml:space="preserve">0 đến 1</w:t>
+      </w:r>
+      <w:r>
+        <w:rPr>
+          <w:rFonts w:ascii="Cambria" w:cs="Cambria" w:eastAsia="Cambria" w:hAnsi="Cambria"/>
+          <w:color w:val="000000"/>
+          <w:sz w:val="22"/>
+          <w:szCs w:val="22"/>
+          <w:rtl w:val="0"/>
+        </w:rPr>
+        <w:t xml:space="preserve">, trong đó </w:t>
+      </w:r>
+      <w:r>
+        <w:rPr>
+          <w:rFonts w:ascii="Cambria" w:cs="Cambria" w:eastAsia="Cambria" w:hAnsi="Cambria"/>
+          <w:b w:val="1"/>
+          <w:bCs w:val="1"/>
+          <w:color w:val="000000"/>
+          <w:sz w:val="22"/>
+          <w:szCs w:val="22"/>
+          <w:rtl w:val="0"/>
+        </w:rPr>
+        <w:t xml:space="preserve">Recall càng cao càng tốt</w:t>
+      </w:r>
+      <w:r>
+        <w:rPr>
+          <w:rFonts w:ascii="Cambria" w:cs="Cambria" w:eastAsia="Cambria" w:hAnsi="Cambria"/>
+          <w:color w:val="000000"/>
+          <w:sz w:val="22"/>
+          <w:szCs w:val="22"/>
+          <w:rtl w:val="0"/>
+        </w:rPr>
+        <w:t xml:space="preserve">.</w:t>
+      </w:r>
+    </w:p>
+    <w:p>
+      <w:pPr>
+        <w:spacing w:line="240" w:lineRule="auto"/>
+        <w:rPr>
+          <w:rFonts w:ascii="Cambria" w:cs="Cambria" w:eastAsia="Cambria" w:hAnsi="Cambria"/>
+          <w:b w:val="1"/>
+          <w:bCs w:val="1"/>
+          <w:color w:val="000000"/>
+          <w:sz w:val="22"/>
+          <w:szCs w:val="22"/>
+        </w:rPr>
+      </w:pPr>
+      <w:r>
+        <w:rPr>
+          <w:rFonts w:ascii="Cambria" w:cs="Cambria" w:eastAsia="Cambria" w:hAnsi="Cambria"/>
+          <w:b w:val="1"/>
+          <w:bCs w:val="1"/>
+          <w:color w:val="000000"/>
+          <w:sz w:val="22"/>
+          <w:szCs w:val="22"/>
+          <w:rtl w:val="0"/>
+        </w:rPr>
+        <w:t xml:space="preserve">Precision - Độ đo phụ</w:t>
+      </w:r>
+    </w:p>
+    <w:p>
+      <w:pPr>
+        <w:spacing w:line="240" w:lineRule="auto"/>
+        <w:rPr>
+          <w:rFonts w:ascii="Cambria" w:cs="Cambria" w:eastAsia="Cambria" w:hAnsi="Cambria"/>
+          <w:color w:val="000000"/>
+          <w:sz w:val="22"/>
+          <w:szCs w:val="22"/>
+        </w:rPr>
+      </w:pPr>
+      <w:r>
+        <w:rPr>
+          <w:rFonts w:ascii="Cambria" w:cs="Cambria" w:eastAsia="Cambria" w:hAnsi="Cambria"/>
+          <w:color w:val="000000"/>
+          <w:sz w:val="22"/>
+          <w:szCs w:val="22"/>
+          <w:rtl w:val="0"/>
+        </w:rPr>
+        <w:t xml:space="preserve">Precision đo tỷ lệ các văn bản mà hệ thống truy xuất là đúng.</w:t>
+      </w:r>
+    </w:p>
+    <w:p>
+      <w:pPr>
+        <w:spacing w:line="240" w:lineRule="auto"/>
+        <w:rPr>
+          <w:rFonts w:ascii="Cambria" w:cs="Cambria" w:eastAsia="Cambria" w:hAnsi="Cambria"/>
+          <w:color w:val="000000"/>
+          <w:sz w:val="22"/>
+          <w:szCs w:val="22"/>
+        </w:rPr>
+      </w:pPr>
+      <w:r>
+        <w:rPr>
+          <w:rFonts w:ascii="Cambria" w:cs="Cambria" w:eastAsia="Cambria" w:hAnsi="Cambria"/>
+          <w:color w:val="000000"/>
+          <w:sz w:val="22"/>
+          <w:szCs w:val="22"/>
+          <w:rtl w:val="0"/>
+        </w:rPr>
+        <w:t xml:space="preserve">Đối với mỗi câu hỏi:</w:t>
+      </w:r>
+    </w:p>
+    <w:p>
+      <w:pPr>
+        <w:spacing w:line="240" w:lineRule="auto"/>
+        <w:rPr>
+          <w:rFonts w:ascii="Cambria" w:cs="Cambria" w:eastAsia="Cambria" w:hAnsi="Cambria"/>
+          <w:color w:val="000000"/>
+          <w:sz w:val="22"/>
+          <w:szCs w:val="22"/>
+        </w:rPr>
+      </w:pPr>
+      <w:r>
+        <w:rPr>
+          <w:rFonts w:ascii="Cambria" w:cs="Cambria" w:eastAsia="Cambria" w:hAnsi="Cambria"/>
+          <w:color w:val="000000"/>
+          <w:sz w:val="22"/>
+          <w:szCs w:val="22"/>
+        </w:rPr>
+        <w:drawing>
+          <wp:inline distB="114300" distT="114300" distL="114300" distR="114300">
+            <wp:extent cx="2197100" cy="330200"/>
+            <wp:effectExtent b="0" l="0" r="0" t="0"/>
+            <wp:docPr id="5" name="image1.gif"/>
+            <a:graphic>
+              <a:graphicData uri="http://schemas.openxmlformats.org/drawingml/2006/picture">
+                <pic:pic>
+                  <pic:nvPicPr>
+                    <pic:cNvPr id="0" name="image1.gif"/>
+                    <pic:cNvPicPr preferRelativeResize="0"/>
+                  </pic:nvPicPr>
+                  <pic:blipFill>
+                    <a:blip r:embed="rId13"/>
+                    <a:srcRect b="0" l="0" r="0" t="0"/>
+                    <a:stretch>
+                      <a:fillRect/>
+                    </a:stretch>
+                  </pic:blipFill>
+                  <pic:spPr>
+                    <a:xfrm>
+                      <a:off x="0" y="0"/>
+                      <a:ext cx="2197100" cy="330200"/>
+                    </a:xfrm>
+                    <a:prstGeom prst="rect"/>
+                    <a:ln/>
+                  </pic:spPr>
+                </pic:pic>
+              </a:graphicData>
+            </a:graphic>
+          </wp:inline>
+        </w:drawing>
+      </w:r>
+      <w:r>
+        <w:rPr>
+          <w:rFonts w:ascii="Cambria" w:cs="Cambria" w:eastAsia="Cambria" w:hAnsi="Cambria"/>
+          <w:color w:val="000000"/>
+          <w:sz w:val="22"/>
+          <w:szCs w:val="22"/>
+          <w:rtl w:val="0"/>
+        </w:rPr>
+        <w:br w:type="textWrapping"/>
+        <w:br w:type="textWrapping"/>
+      </w:r>
+    </w:p>
+    <w:p>
+      <w:pPr>
+        <w:spacing w:line="240" w:lineRule="auto"/>
+        <w:rPr>
+          <w:rFonts w:ascii="Cambria" w:cs="Cambria" w:eastAsia="Cambria" w:hAnsi="Cambria"/>
+          <w:color w:val="000000"/>
+          <w:sz w:val="22"/>
+          <w:szCs w:val="22"/>
+        </w:rPr>
+      </w:pPr>
+      <w:r>
+        <w:rPr>
+          <w:rFonts w:ascii="Cambria" w:cs="Cambria" w:eastAsia="Cambria" w:hAnsi="Cambria"/>
+          <w:color w:val="000000"/>
+          <w:sz w:val="22"/>
+          <w:szCs w:val="22"/>
+          <w:rtl w:val="0"/>
+        </w:rPr>
+        <w:t xml:space="preserve">Trong đó:</w:t>
+      </w:r>
+    </w:p>
+    <w:p>
+      <w:pPr>
+        <w:numPr>
+          <w:ilvl w:val="0"/>
+          <w:numId w:val="3"/>
+        </w:numPr>
+        <w:spacing w:after="0" w:line="240" w:lineRule="auto"/>
+        <w:ind w:left="720" w:hanging="360"/>
+        <w:rPr>
+          <w:rFonts w:ascii="Cambria" w:cs="Cambria" w:eastAsia="Cambria" w:hAnsi="Cambria"/>
+          <w:color w:val="000000"/>
+          <w:sz w:val="22"/>
+          <w:szCs w:val="22"/>
+        </w:rPr>
+      </w:pPr>
+      <w:r>
+        <w:rPr>
+          <w:rFonts w:ascii="Cambria" w:cs="Cambria" w:eastAsia="Cambria" w:hAnsi="Cambria"/>
+          <w:color w:val="000000"/>
+          <w:sz w:val="22"/>
+          <w:szCs w:val="22"/>
+        </w:rPr>
+        <w:drawing>
+          <wp:inline distB="114300" distT="114300" distL="114300" distR="114300">
+            <wp:extent cx="558800" cy="177800"/>
+            <wp:effectExtent b="0" l="0" r="0" t="0"/>
+            <wp:docPr id="1" name="image9.gif"/>
             <a:graphic>
               <a:graphicData uri="http://schemas.openxmlformats.org/drawingml/2006/picture">
                 <pic:pic>
@@ -2611,8 +3162,24 @@
           <w:szCs w:val="22"/>
           <w:rtl w:val="0"/>
         </w:rPr>
-        <w:t xml:space="preserve"> là tập các document_id đúng của câu hỏi thứ </w:t>
-      </w:r>
+        <w:t xml:space="preserve"> là tập các document_id đúng.</w:t>
+      </w:r>
+    </w:p>
+    <w:p>
+      <w:pPr>
+        <w:numPr>
+          <w:ilvl w:val="0"/>
+          <w:numId w:val="3"/>
+        </w:numPr>
+        <w:spacing w:after="0" w:line="240" w:lineRule="auto"/>
+        <w:ind w:left="720" w:hanging="360"/>
+        <w:rPr>
+          <w:rFonts w:ascii="Cambria" w:cs="Cambria" w:eastAsia="Cambria" w:hAnsi="Cambria"/>
+          <w:color w:val="000000"/>
+          <w:sz w:val="22"/>
+          <w:szCs w:val="22"/>
+        </w:rPr>
+      </w:pPr>
       <w:r>
         <w:rPr>
           <w:rFonts w:ascii="Cambria" w:cs="Cambria" w:eastAsia="Cambria" w:hAnsi="Cambria"/>
@@ -2622,80 +3189,14 @@
         </w:rPr>
         <w:drawing>
           <wp:inline distB="114300" distT="114300" distL="114300" distR="114300">
-            <wp:extent cx="50800" cy="177800"/>
+            <wp:extent cx="596900" cy="177800"/>
             <wp:effectExtent b="0" l="0" r="0" t="0"/>
-            <wp:docPr id="9" name="image10.gif"/>
+            <wp:docPr id="2" name="image4.gif"/>
             <a:graphic>
               <a:graphicData uri="http://schemas.openxmlformats.org/drawingml/2006/picture">
                 <pic:pic>
                   <pic:nvPicPr>
-                    <pic:cNvPr id="0" name="image10.gif"/>
-                    <pic:cNvPicPr preferRelativeResize="0"/>
-                  </pic:nvPicPr>
-                  <pic:blipFill>
-                    <a:blip r:embed="rId9"/>
-                    <a:srcRect b="0" l="0" r="0" t="0"/>
-                    <a:stretch>
-                      <a:fillRect/>
-                    </a:stretch>
-                  </pic:blipFill>
-                  <pic:spPr>
-                    <a:xfrm>
-                      <a:off x="0" y="0"/>
-                      <a:ext cx="50800" cy="177800"/>
-                    </a:xfrm>
-                    <a:prstGeom prst="rect"/>
-                    <a:ln/>
-                  </pic:spPr>
-                </pic:pic>
-              </a:graphicData>
-            </a:graphic>
-          </wp:inline>
-        </w:drawing>
-      </w:r>
-      <w:r>
-        <w:rPr>
-          <w:rFonts w:ascii="Cambria" w:cs="Cambria" w:eastAsia="Cambria" w:hAnsi="Cambria"/>
-          <w:color w:val="000000"/>
-          <w:sz w:val="22"/>
-          <w:szCs w:val="22"/>
-          <w:rtl w:val="0"/>
-        </w:rPr>
-        <w:t xml:space="preserve">.</w:t>
-      </w:r>
-    </w:p>
-    <w:p>
-      <w:pPr>
-        <w:numPr>
-          <w:ilvl w:val="0"/>
-          <w:numId w:val="1"/>
-        </w:numPr>
-        <w:spacing w:after="0" w:line="240" w:lineRule="auto"/>
-        <w:ind w:left="720" w:hanging="360"/>
-        <w:rPr>
-          <w:rFonts w:ascii="Cambria" w:cs="Cambria" w:eastAsia="Cambria" w:hAnsi="Cambria"/>
-          <w:color w:val="000000"/>
-          <w:sz w:val="22"/>
-          <w:szCs w:val="22"/>
-        </w:rPr>
-      </w:pPr>
-      <w:r>
-        <w:rPr>
-          <w:rFonts w:ascii="Cambria" w:cs="Cambria" w:eastAsia="Cambria" w:hAnsi="Cambria"/>
-          <w:color w:val="000000"/>
-          <w:sz w:val="22"/>
-          <w:szCs w:val="22"/>
-        </w:rPr>
-        <w:drawing>
-          <wp:inline distB="114300" distT="114300" distL="114300" distR="114300">
-            <wp:extent cx="596900" cy="177800"/>
-            <wp:effectExtent b="0" l="0" r="0" t="0"/>
-            <wp:docPr id="4" name="image6.gif"/>
-            <a:graphic>
-              <a:graphicData uri="http://schemas.openxmlformats.org/drawingml/2006/picture">
-                <pic:pic>
-                  <pic:nvPicPr>
-                    <pic:cNvPr id="0" name="image6.gif"/>
+                    <pic:cNvPr id="0" name="image4.gif"/>
                     <pic:cNvPicPr preferRelativeResize="0"/>
                   </pic:nvPicPr>
                   <pic:blipFill>
@@ -2727,7 +3228,7 @@
           <w:szCs w:val="22"/>
           <w:rtl w:val="0"/>
         </w:rPr>
-        <w:t xml:space="preserve"> là tập các document_id mà hệ thống trả về.</w:t>
+        <w:t xml:space="preserve"> là tập các document_id được hệ thống trả về.</w:t>
       </w:r>
     </w:p>
     <w:p>
@@ -2748,7 +3249,7 @@
           <w:szCs w:val="22"/>
           <w:rtl w:val="0"/>
         </w:rPr>
-        <w:t xml:space="preserve">Điểm Recall cuối cùng được tính bằng trung bình trên toàn bộ câu hỏi:</w:t>
+        <w:t xml:space="preserve">Điểm Precision cuối cùng được tính bằng trung bình trên toàn bộ câu hỏi:</w:t>
       </w:r>
     </w:p>
     <w:p>
@@ -2770,515 +3271,14 @@
         </w:rPr>
         <w:drawing>
           <wp:inline distB="114300" distT="114300" distL="114300" distR="114300">
-            <wp:extent cx="1244600" cy="444500"/>
+            <wp:extent cx="1625600" cy="444500"/>
             <wp:effectExtent b="0" l="0" r="0" t="0"/>
-            <wp:docPr id="3" name="image3.gif"/>
+            <wp:docPr id="7" name="image10.gif"/>
             <a:graphic>
               <a:graphicData uri="http://schemas.openxmlformats.org/drawingml/2006/picture">
                 <pic:pic>
                   <pic:nvPicPr>
-                    <pic:cNvPr id="0" name="image3.gif"/>
-                    <pic:cNvPicPr preferRelativeResize="0"/>
-                  </pic:nvPicPr>
-                  <pic:blipFill>
-                    <a:blip r:embed="rId11"/>
-                    <a:srcRect b="0" l="0" r="0" t="0"/>
-                    <a:stretch>
-                      <a:fillRect/>
-                    </a:stretch>
-                  </pic:blipFill>
-                  <pic:spPr>
-                    <a:xfrm>
-                      <a:off x="0" y="0"/>
-                      <a:ext cx="1244600" cy="444500"/>
-                    </a:xfrm>
-                    <a:prstGeom prst="rect"/>
-                    <a:ln/>
-                  </pic:spPr>
-                </pic:pic>
-              </a:graphicData>
-            </a:graphic>
-          </wp:inline>
-        </w:drawing>
-      </w:r>
-      <w:r>
-        <w:rPr>
-          <w:rFonts w:ascii="Cambria" w:cs="Cambria" w:eastAsia="Cambria" w:hAnsi="Cambria"/>
-          <w:color w:val="000000"/>
-          <w:sz w:val="22"/>
-          <w:szCs w:val="22"/>
-          <w:rtl w:val="0"/>
-        </w:rPr>
-        <w:br w:type="textWrapping"/>
-        <w:br w:type="textWrapping"/>
-      </w:r>
-    </w:p>
-    <w:p>
-      <w:pPr>
-        <w:spacing w:line="240" w:lineRule="auto"/>
-        <w:rPr>
-          <w:rFonts w:ascii="Cambria" w:cs="Cambria" w:eastAsia="Cambria" w:hAnsi="Cambria"/>
-          <w:color w:val="000000"/>
-          <w:sz w:val="22"/>
-          <w:szCs w:val="22"/>
-        </w:rPr>
-      </w:pPr>
-      <w:r>
-        <w:rPr>
-          <w:rFonts w:ascii="Cambria" w:cs="Cambria" w:eastAsia="Cambria" w:hAnsi="Cambria"/>
-          <w:color w:val="000000"/>
-          <w:sz w:val="22"/>
-          <w:szCs w:val="22"/>
-          <w:rtl w:val="0"/>
-        </w:rPr>
-        <w:t xml:space="preserve">Trong đó </w:t>
-      </w:r>
-      <w:r>
-        <w:rPr>
-          <w:rFonts w:ascii="Cambria" w:cs="Cambria" w:eastAsia="Cambria" w:hAnsi="Cambria"/>
-          <w:color w:val="000000"/>
-          <w:sz w:val="22"/>
-          <w:szCs w:val="22"/>
-        </w:rPr>
-        <w:drawing>
-          <wp:inline distB="114300" distT="114300" distL="114300" distR="114300">
-            <wp:extent cx="101600" cy="177800"/>
-            <wp:effectExtent b="0" l="0" r="0" t="0"/>
-            <wp:docPr id="8" name="image5.gif"/>
-            <a:graphic>
-              <a:graphicData uri="http://schemas.openxmlformats.org/drawingml/2006/picture">
-                <pic:pic>
-                  <pic:nvPicPr>
-                    <pic:cNvPr id="0" name="image5.gif"/>
-                    <pic:cNvPicPr preferRelativeResize="0"/>
-                  </pic:nvPicPr>
-                  <pic:blipFill>
-                    <a:blip r:embed="rId12"/>
-                    <a:srcRect b="0" l="0" r="0" t="0"/>
-                    <a:stretch>
-                      <a:fillRect/>
-                    </a:stretch>
-                  </pic:blipFill>
-                  <pic:spPr>
-                    <a:xfrm>
-                      <a:off x="0" y="0"/>
-                      <a:ext cx="101600" cy="177800"/>
-                    </a:xfrm>
-                    <a:prstGeom prst="rect"/>
-                    <a:ln/>
-                  </pic:spPr>
-                </pic:pic>
-              </a:graphicData>
-            </a:graphic>
-          </wp:inline>
-        </w:drawing>
-      </w:r>
-      <w:r>
-        <w:rPr>
-          <w:rFonts w:ascii="Cambria" w:cs="Cambria" w:eastAsia="Cambria" w:hAnsi="Cambria"/>
-          <w:color w:val="000000"/>
-          <w:sz w:val="22"/>
-          <w:szCs w:val="22"/>
-          <w:rtl w:val="0"/>
-        </w:rPr>
-        <w:t xml:space="preserve"> là tổng số câu hỏi.</w:t>
-      </w:r>
-    </w:p>
-    <w:p>
-      <w:pPr>
-        <w:spacing w:line="240" w:lineRule="auto"/>
-        <w:rPr>
-          <w:rFonts w:ascii="Cambria" w:cs="Cambria" w:eastAsia="Cambria" w:hAnsi="Cambria"/>
-          <w:color w:val="000000"/>
-          <w:sz w:val="22"/>
-          <w:szCs w:val="22"/>
-        </w:rPr>
-      </w:pPr>
-      <w:r>
-        <w:rPr>
-          <w:rFonts w:ascii="Cambria" w:cs="Cambria" w:eastAsia="Cambria" w:hAnsi="Cambria"/>
-          <w:color w:val="000000"/>
-          <w:sz w:val="22"/>
-          <w:szCs w:val="22"/>
-          <w:rtl w:val="0"/>
-        </w:rPr>
-        <w:t xml:space="preserve">Recall có giá trị trong khoảng </w:t>
-      </w:r>
-      <w:r>
-        <w:rPr>
-          <w:rFonts w:ascii="Cambria" w:cs="Cambria" w:eastAsia="Cambria" w:hAnsi="Cambria"/>
-          <w:b w:val="1"/>
-          <w:bCs w:val="1"/>
-          <w:color w:val="000000"/>
-          <w:sz w:val="22"/>
-          <w:szCs w:val="22"/>
-          <w:rtl w:val="0"/>
-        </w:rPr>
-        <w:t xml:space="preserve">0 đến 1</w:t>
-      </w:r>
-      <w:r>
-        <w:rPr>
-          <w:rFonts w:ascii="Cambria" w:cs="Cambria" w:eastAsia="Cambria" w:hAnsi="Cambria"/>
-          <w:color w:val="000000"/>
-          <w:sz w:val="22"/>
-          <w:szCs w:val="22"/>
-          <w:rtl w:val="0"/>
-        </w:rPr>
-        <w:t xml:space="preserve">, trong đó </w:t>
-      </w:r>
-      <w:r>
-        <w:rPr>
-          <w:rFonts w:ascii="Cambria" w:cs="Cambria" w:eastAsia="Cambria" w:hAnsi="Cambria"/>
-          <w:b w:val="1"/>
-          <w:bCs w:val="1"/>
-          <w:color w:val="000000"/>
-          <w:sz w:val="22"/>
-          <w:szCs w:val="22"/>
-          <w:rtl w:val="0"/>
-        </w:rPr>
-        <w:t xml:space="preserve">Recall càng cao càng tốt</w:t>
-      </w:r>
-      <w:r>
-        <w:rPr>
-          <w:rFonts w:ascii="Cambria" w:cs="Cambria" w:eastAsia="Cambria" w:hAnsi="Cambria"/>
-          <w:color w:val="000000"/>
-          <w:sz w:val="22"/>
-          <w:szCs w:val="22"/>
-          <w:rtl w:val="0"/>
-        </w:rPr>
-        <w:t xml:space="preserve">.</w:t>
-      </w:r>
-    </w:p>
-    <w:p>
-      <w:pPr>
-        <w:spacing w:line="240" w:lineRule="auto"/>
-        <w:rPr>
-          <w:rFonts w:ascii="Cambria" w:cs="Cambria" w:eastAsia="Cambria" w:hAnsi="Cambria"/>
-          <w:b w:val="1"/>
-          <w:bCs w:val="1"/>
-          <w:color w:val="000000"/>
-          <w:sz w:val="22"/>
-          <w:szCs w:val="22"/>
-        </w:rPr>
-      </w:pPr>
-      <w:r>
-        <w:rPr>
-          <w:rFonts w:ascii="Cambria" w:cs="Cambria" w:eastAsia="Cambria" w:hAnsi="Cambria"/>
-          <w:b w:val="1"/>
-          <w:bCs w:val="1"/>
-          <w:color w:val="000000"/>
-          <w:sz w:val="22"/>
-          <w:szCs w:val="22"/>
-          <w:rtl w:val="0"/>
-        </w:rPr>
-        <w:t xml:space="preserve">Precision - Độ đo phụ</w:t>
-      </w:r>
-    </w:p>
-    <w:p>
-      <w:pPr>
-        <w:spacing w:line="240" w:lineRule="auto"/>
-        <w:rPr>
-          <w:rFonts w:ascii="Cambria" w:cs="Cambria" w:eastAsia="Cambria" w:hAnsi="Cambria"/>
-          <w:color w:val="000000"/>
-          <w:sz w:val="22"/>
-          <w:szCs w:val="22"/>
-        </w:rPr>
-      </w:pPr>
-      <w:r>
-        <w:rPr>
-          <w:rFonts w:ascii="Cambria" w:cs="Cambria" w:eastAsia="Cambria" w:hAnsi="Cambria"/>
-          <w:color w:val="000000"/>
-          <w:sz w:val="22"/>
-          <w:szCs w:val="22"/>
-          <w:rtl w:val="0"/>
-        </w:rPr>
-        <w:t xml:space="preserve">Precision đo tỷ lệ các văn bản mà hệ thống truy xuất là đúng.</w:t>
-      </w:r>
-    </w:p>
-    <w:p>
-      <w:pPr>
-        <w:spacing w:line="240" w:lineRule="auto"/>
-        <w:rPr>
-          <w:rFonts w:ascii="Cambria" w:cs="Cambria" w:eastAsia="Cambria" w:hAnsi="Cambria"/>
-          <w:color w:val="000000"/>
-          <w:sz w:val="22"/>
-          <w:szCs w:val="22"/>
-        </w:rPr>
-      </w:pPr>
-      <w:r>
-        <w:rPr>
-          <w:rFonts w:ascii="Cambria" w:cs="Cambria" w:eastAsia="Cambria" w:hAnsi="Cambria"/>
-          <w:color w:val="000000"/>
-          <w:sz w:val="22"/>
-          <w:szCs w:val="22"/>
-          <w:rtl w:val="0"/>
-        </w:rPr>
-        <w:t xml:space="preserve">Đối với mỗi câu hỏi:</w:t>
-      </w:r>
-    </w:p>
-    <w:p>
-      <w:pPr>
-        <w:spacing w:line="240" w:lineRule="auto"/>
-        <w:rPr>
-          <w:rFonts w:ascii="Cambria" w:cs="Cambria" w:eastAsia="Cambria" w:hAnsi="Cambria"/>
-          <w:color w:val="000000"/>
-          <w:sz w:val="22"/>
-          <w:szCs w:val="22"/>
-        </w:rPr>
-      </w:pPr>
-      <w:r>
-        <w:rPr>
-          <w:rFonts w:ascii="Cambria" w:cs="Cambria" w:eastAsia="Cambria" w:hAnsi="Cambria"/>
-          <w:color w:val="000000"/>
-          <w:sz w:val="22"/>
-          <w:szCs w:val="22"/>
-        </w:rPr>
-        <w:drawing>
-          <wp:inline distB="114300" distT="114300" distL="114300" distR="114300">
-            <wp:extent cx="2197100" cy="330200"/>
-            <wp:effectExtent b="0" l="0" r="0" t="0"/>
-            <wp:docPr id="5" name="image2.gif"/>
-            <a:graphic>
-              <a:graphicData uri="http://schemas.openxmlformats.org/drawingml/2006/picture">
-                <pic:pic>
-                  <pic:nvPicPr>
-                    <pic:cNvPr id="0" name="image2.gif"/>
-                    <pic:cNvPicPr preferRelativeResize="0"/>
-                  </pic:nvPicPr>
-                  <pic:blipFill>
-                    <a:blip r:embed="rId13"/>
-                    <a:srcRect b="0" l="0" r="0" t="0"/>
-                    <a:stretch>
-                      <a:fillRect/>
-                    </a:stretch>
-                  </pic:blipFill>
-                  <pic:spPr>
-                    <a:xfrm>
-                      <a:off x="0" y="0"/>
-                      <a:ext cx="2197100" cy="330200"/>
-                    </a:xfrm>
-                    <a:prstGeom prst="rect"/>
-                    <a:ln/>
-                  </pic:spPr>
-                </pic:pic>
-              </a:graphicData>
-            </a:graphic>
-          </wp:inline>
-        </w:drawing>
-      </w:r>
-      <w:r>
-        <w:rPr>
-          <w:rFonts w:ascii="Cambria" w:cs="Cambria" w:eastAsia="Cambria" w:hAnsi="Cambria"/>
-          <w:color w:val="000000"/>
-          <w:sz w:val="22"/>
-          <w:szCs w:val="22"/>
-          <w:rtl w:val="0"/>
-        </w:rPr>
-        <w:br w:type="textWrapping"/>
-        <w:br w:type="textWrapping"/>
-      </w:r>
-    </w:p>
-    <w:p>
-      <w:pPr>
-        <w:spacing w:line="240" w:lineRule="auto"/>
-        <w:rPr>
-          <w:rFonts w:ascii="Cambria" w:cs="Cambria" w:eastAsia="Cambria" w:hAnsi="Cambria"/>
-          <w:color w:val="000000"/>
-          <w:sz w:val="22"/>
-          <w:szCs w:val="22"/>
-        </w:rPr>
-      </w:pPr>
-      <w:r>
-        <w:rPr>
-          <w:rFonts w:ascii="Cambria" w:cs="Cambria" w:eastAsia="Cambria" w:hAnsi="Cambria"/>
-          <w:color w:val="000000"/>
-          <w:sz w:val="22"/>
-          <w:szCs w:val="22"/>
-          <w:rtl w:val="0"/>
-        </w:rPr>
-        <w:t xml:space="preserve">Trong đó:</w:t>
-      </w:r>
-    </w:p>
-    <w:p>
-      <w:pPr>
-        <w:numPr>
-          <w:ilvl w:val="0"/>
-          <w:numId w:val="3"/>
-        </w:numPr>
-        <w:spacing w:after="0" w:line="240" w:lineRule="auto"/>
-        <w:ind w:left="720" w:hanging="360"/>
-        <w:rPr>
-          <w:rFonts w:ascii="Cambria" w:cs="Cambria" w:eastAsia="Cambria" w:hAnsi="Cambria"/>
-          <w:color w:val="000000"/>
-          <w:sz w:val="22"/>
-          <w:szCs w:val="22"/>
-        </w:rPr>
-      </w:pPr>
-      <w:r>
-        <w:rPr>
-          <w:rFonts w:ascii="Cambria" w:cs="Cambria" w:eastAsia="Cambria" w:hAnsi="Cambria"/>
-          <w:color w:val="000000"/>
-          <w:sz w:val="22"/>
-          <w:szCs w:val="22"/>
-        </w:rPr>
-        <w:drawing>
-          <wp:inline distB="114300" distT="114300" distL="114300" distR="114300">
-            <wp:extent cx="558800" cy="177800"/>
-            <wp:effectExtent b="0" l="0" r="0" t="0"/>
-            <wp:docPr id="1" name="image1.gif"/>
-            <a:graphic>
-              <a:graphicData uri="http://schemas.openxmlformats.org/drawingml/2006/picture">
-                <pic:pic>
-                  <pic:nvPicPr>
-                    <pic:cNvPr id="0" name="image1.gif"/>
-                    <pic:cNvPicPr preferRelativeResize="0"/>
-                  </pic:nvPicPr>
-                  <pic:blipFill>
-                    <a:blip r:embed="rId8"/>
-                    <a:srcRect b="0" l="0" r="0" t="0"/>
-                    <a:stretch>
-                      <a:fillRect/>
-                    </a:stretch>
-                  </pic:blipFill>
-                  <pic:spPr>
-                    <a:xfrm>
-                      <a:off x="0" y="0"/>
-                      <a:ext cx="558800" cy="177800"/>
-                    </a:xfrm>
-                    <a:prstGeom prst="rect"/>
-                    <a:ln/>
-                  </pic:spPr>
-                </pic:pic>
-              </a:graphicData>
-            </a:graphic>
-          </wp:inline>
-        </w:drawing>
-      </w:r>
-      <w:r>
-        <w:rPr>
-          <w:rFonts w:ascii="Cambria" w:cs="Cambria" w:eastAsia="Cambria" w:hAnsi="Cambria"/>
-          <w:color w:val="000000"/>
-          <w:sz w:val="22"/>
-          <w:szCs w:val="22"/>
-          <w:rtl w:val="0"/>
-        </w:rPr>
-        <w:t xml:space="preserve"> là tập các document_id đúng.</w:t>
-      </w:r>
-    </w:p>
-    <w:p>
-      <w:pPr>
-        <w:numPr>
-          <w:ilvl w:val="0"/>
-          <w:numId w:val="3"/>
-        </w:numPr>
-        <w:spacing w:after="0" w:line="240" w:lineRule="auto"/>
-        <w:ind w:left="720" w:hanging="360"/>
-        <w:rPr>
-          <w:rFonts w:ascii="Cambria" w:cs="Cambria" w:eastAsia="Cambria" w:hAnsi="Cambria"/>
-          <w:color w:val="000000"/>
-          <w:sz w:val="22"/>
-          <w:szCs w:val="22"/>
-        </w:rPr>
-      </w:pPr>
-      <w:r>
-        <w:rPr>
-          <w:rFonts w:ascii="Cambria" w:cs="Cambria" w:eastAsia="Cambria" w:hAnsi="Cambria"/>
-          <w:color w:val="000000"/>
-          <w:sz w:val="22"/>
-          <w:szCs w:val="22"/>
-        </w:rPr>
-        <w:drawing>
-          <wp:inline distB="114300" distT="114300" distL="114300" distR="114300">
-            <wp:extent cx="596900" cy="177800"/>
-            <wp:effectExtent b="0" l="0" r="0" t="0"/>
-            <wp:docPr id="2" name="image7.gif"/>
-            <a:graphic>
-              <a:graphicData uri="http://schemas.openxmlformats.org/drawingml/2006/picture">
-                <pic:pic>
-                  <pic:nvPicPr>
-                    <pic:cNvPr id="0" name="image7.gif"/>
-                    <pic:cNvPicPr preferRelativeResize="0"/>
-                  </pic:nvPicPr>
-                  <pic:blipFill>
-                    <a:blip r:embed="rId10"/>
-                    <a:srcRect b="0" l="0" r="0" t="0"/>
-                    <a:stretch>
-                      <a:fillRect/>
-                    </a:stretch>
-                  </pic:blipFill>
-                  <pic:spPr>
-                    <a:xfrm>
-                      <a:off x="0" y="0"/>
-                      <a:ext cx="596900" cy="177800"/>
-                    </a:xfrm>
-                    <a:prstGeom prst="rect"/>
-                    <a:ln/>
-                  </pic:spPr>
-                </pic:pic>
-              </a:graphicData>
-            </a:graphic>
-          </wp:inline>
-        </w:drawing>
-      </w:r>
-      <w:r>
-        <w:rPr>
-          <w:rFonts w:ascii="Cambria" w:cs="Cambria" w:eastAsia="Cambria" w:hAnsi="Cambria"/>
-          <w:color w:val="000000"/>
-          <w:sz w:val="22"/>
-          <w:szCs w:val="22"/>
-          <w:rtl w:val="0"/>
-        </w:rPr>
-        <w:t xml:space="preserve"> là tập các document_id được hệ thống trả về.</w:t>
-      </w:r>
-    </w:p>
-    <w:p>
-      <w:pPr>
-        <w:spacing w:line="240" w:lineRule="auto"/>
-        <w:rPr>
-          <w:rFonts w:ascii="Cambria" w:cs="Cambria" w:eastAsia="Cambria" w:hAnsi="Cambria"/>
-          <w:color w:val="000000"/>
-          <w:sz w:val="22"/>
-          <w:szCs w:val="22"/>
-        </w:rPr>
-      </w:pPr>
-      <w:r>
-        <w:rPr>
-          <w:rFonts w:ascii="Cambria" w:cs="Cambria" w:eastAsia="Cambria" w:hAnsi="Cambria"/>
-          <w:color w:val="000000"/>
-          <w:sz w:val="22"/>
-          <w:szCs w:val="22"/>
-          <w:rtl w:val="0"/>
-        </w:rPr>
-        <w:t xml:space="preserve">Điểm Precision cuối cùng được tính bằng trung bình trên toàn bộ câu hỏi:</w:t>
-      </w:r>
-    </w:p>
-    <w:p>
-      <w:pPr>
-        <w:spacing w:line="240" w:lineRule="auto"/>
-        <w:rPr>
-          <w:rFonts w:ascii="Cambria" w:cs="Cambria" w:eastAsia="Cambria" w:hAnsi="Cambria"/>
-          <w:color w:val="000000"/>
-          <w:sz w:val="22"/>
-          <w:szCs w:val="22"/>
-        </w:rPr>
-      </w:pPr>
-      <w:r>
-        <w:rPr>
-          <w:rFonts w:ascii="Cambria" w:cs="Cambria" w:eastAsia="Cambria" w:hAnsi="Cambria"/>
-          <w:color w:val="000000"/>
-          <w:sz w:val="22"/>
-          <w:szCs w:val="22"/>
-        </w:rPr>
-        <w:drawing>
-          <wp:inline distB="114300" distT="114300" distL="114300" distR="114300">
-            <wp:extent cx="1625600" cy="444500"/>
-            <wp:effectExtent b="0" l="0" r="0" t="0"/>
-            <wp:docPr id="7" name="image8.gif"/>
-            <a:graphic>
-              <a:graphicData uri="http://schemas.openxmlformats.org/drawingml/2006/picture">
-                <pic:pic>
-                  <pic:nvPicPr>
-                    <pic:cNvPr id="0" name="image8.gif"/>
+                    <pic:cNvPr id="0" name="image10.gif"/>
                     <pic:cNvPicPr preferRelativeResize="0"/>
                   </pic:nvPicPr>
                   <pic:blipFill>
@@ -3424,54 +3424,6 @@
     </w:p>
     <w:p>
       <w:pPr>
-        <w:spacing w:line="240" w:lineRule="auto"/>
-        <w:rPr>
-          <w:rFonts w:ascii="Cambria" w:cs="Cambria" w:eastAsia="Cambria" w:hAnsi="Cambria"/>
-          <w:color w:val="000000"/>
-          <w:sz w:val="22"/>
-          <w:szCs w:val="22"/>
-        </w:rPr>
-      </w:pPr>
-      <w:r>
-        <w:rPr>
-          <w:rtl w:val="0"/>
-        </w:rPr>
-      </w:r>
-    </w:p>
-    <w:p>
-      <w:pPr>
-        <w:spacing w:after="0" w:line="240" w:lineRule="auto"/>
-        <w:rPr>
-          <w:rFonts w:ascii="Times New Roman" w:cs="Times New Roman" w:eastAsia="Times New Roman" w:hAnsi="Times New Roman"/>
-          <w:color w:val="000000"/>
-          <w:sz w:val="22"/>
-          <w:szCs w:val="22"/>
-        </w:rPr>
-      </w:pPr>
-      <w:r>
-        <w:rPr>
-          <w:rtl w:val="0"/>
-        </w:rPr>
-      </w:r>
-    </w:p>
-    <w:p>
-      <w:pPr>
-        <w:spacing w:after="0" w:line="276" w:lineRule="auto"/>
-        <w:rPr>
-          <w:rFonts w:ascii="Cambria" w:cs="Cambria" w:eastAsia="Cambria" w:hAnsi="Cambria"/>
-          <w:color w:val="000000"/>
-          <w:sz w:val="22"/>
-          <w:szCs w:val="22"/>
-        </w:rPr>
-      </w:pPr>
-      <w:r>
-        <w:rPr>
-          <w:rtl w:val="0"/>
-        </w:rPr>
-      </w:r>
-    </w:p>
-    <w:p>
-      <w:pPr>
         <w:pStyle w:val="Heading1"/>
         <w:keepNext w:val="0"/>
         <w:keepLines w:val="0"/>
@@ -3512,7 +3464,9 @@
       <w:pPr>
         <w:spacing w:line="240" w:lineRule="auto"/>
         <w:rPr>
-          <w:rFonts w:ascii="Times New Roman" w:cs="Times New Roman" w:eastAsia="Times New Roman" w:hAnsi="Times New Roman"/>
+          <w:rFonts w:ascii="Cambria" w:cs="Cambria" w:eastAsia="Cambria" w:hAnsi="Cambria"/>
+          <w:b w:val="1"/>
+          <w:bCs w:val="1"/>
           <w:color w:val="000000"/>
           <w:sz w:val="22"/>
           <w:szCs w:val="22"/>
@@ -3543,6 +3497,192 @@
         <w:br w:type="textWrapping"/>
         <w:br w:type="textWrapping"/>
       </w:r>
+      <w:r>
+        <w:rPr>
+          <w:rFonts w:ascii="Cambria" w:cs="Cambria" w:eastAsia="Cambria" w:hAnsi="Cambria"/>
+          <w:b w:val="1"/>
+          <w:bCs w:val="1"/>
+          <w:color w:val="000000"/>
+          <w:sz w:val="22"/>
+          <w:szCs w:val="22"/>
+          <w:rtl w:val="0"/>
+        </w:rPr>
+        <w:t xml:space="preserve">Ràng buộc đánh giá</w:t>
+      </w:r>
+    </w:p>
+    <w:p>
+      <w:pPr>
+        <w:spacing w:after="240" w:before="240" w:line="240" w:lineRule="auto"/>
+        <w:rPr>
+          <w:rFonts w:ascii="Cambria" w:cs="Cambria" w:eastAsia="Cambria" w:hAnsi="Cambria"/>
+          <w:color w:val="000000"/>
+          <w:sz w:val="22"/>
+          <w:szCs w:val="22"/>
+        </w:rPr>
+      </w:pPr>
+      <w:r>
+        <w:rPr>
+          <w:rFonts w:ascii="Cambria" w:cs="Cambria" w:eastAsia="Cambria" w:hAnsi="Cambria"/>
+          <w:color w:val="000000"/>
+          <w:sz w:val="22"/>
+          <w:szCs w:val="22"/>
+          <w:rtl w:val="0"/>
+        </w:rPr>
+        <w:t xml:space="preserve">Đối với mỗi câu hỏi, hệ thống chỉ đánh giá tối đa </w:t>
+      </w:r>
+      <w:r>
+        <w:rPr>
+          <w:rFonts w:ascii="Cambria" w:cs="Cambria" w:eastAsia="Cambria" w:hAnsi="Cambria"/>
+          <w:b w:val="1"/>
+          <w:bCs w:val="1"/>
+          <w:color w:val="000000"/>
+          <w:sz w:val="22"/>
+          <w:szCs w:val="22"/>
+          <w:rtl w:val="0"/>
+        </w:rPr>
+        <w:t xml:space="preserve">05 </w:t>
+      </w:r>
+      <w:r>
+        <w:rPr>
+          <w:rFonts w:ascii="Roboto Mono" w:cs="Roboto Mono" w:eastAsia="Roboto Mono" w:hAnsi="Roboto Mono"/>
+          <w:b w:val="1"/>
+          <w:bCs w:val="1"/>
+          <w:color w:val="000000"/>
+          <w:sz w:val="22"/>
+          <w:szCs w:val="22"/>
+          <w:rtl w:val="0"/>
+        </w:rPr>
+        <w:t xml:space="preserve">document_id</w:t>
+      </w:r>
+      <w:r>
+        <w:rPr>
+          <w:rFonts w:ascii="Cambria" w:cs="Cambria" w:eastAsia="Cambria" w:hAnsi="Cambria"/>
+          <w:color w:val="000000"/>
+          <w:sz w:val="22"/>
+          <w:szCs w:val="22"/>
+          <w:rtl w:val="0"/>
+        </w:rPr>
+        <w:t xml:space="preserve">.</w:t>
+      </w:r>
+    </w:p>
+    <w:p>
+      <w:pPr>
+        <w:spacing w:after="240" w:before="240" w:line="240" w:lineRule="auto"/>
+        <w:rPr>
+          <w:rFonts w:ascii="Cambria" w:cs="Cambria" w:eastAsia="Cambria" w:hAnsi="Cambria"/>
+          <w:color w:val="000000"/>
+          <w:sz w:val="22"/>
+          <w:szCs w:val="22"/>
+        </w:rPr>
+      </w:pPr>
+      <w:r>
+        <w:rPr>
+          <w:rFonts w:ascii="Cambria" w:cs="Cambria" w:eastAsia="Cambria" w:hAnsi="Cambria"/>
+          <w:color w:val="000000"/>
+          <w:sz w:val="22"/>
+          <w:szCs w:val="22"/>
+          <w:rtl w:val="0"/>
+        </w:rPr>
+        <w:t xml:space="preserve">Nếu kết quả dự đoán của một câu hỏi chứa </w:t>
+      </w:r>
+      <w:r>
+        <w:rPr>
+          <w:rFonts w:ascii="Cambria" w:cs="Cambria" w:eastAsia="Cambria" w:hAnsi="Cambria"/>
+          <w:b w:val="1"/>
+          <w:bCs w:val="1"/>
+          <w:color w:val="000000"/>
+          <w:sz w:val="22"/>
+          <w:szCs w:val="22"/>
+          <w:rtl w:val="0"/>
+        </w:rPr>
+        <w:t xml:space="preserve">nhiều hơn 05 </w:t>
+      </w:r>
+      <w:r>
+        <w:rPr>
+          <w:rFonts w:ascii="Roboto Mono" w:cs="Roboto Mono" w:eastAsia="Roboto Mono" w:hAnsi="Roboto Mono"/>
+          <w:b w:val="1"/>
+          <w:bCs w:val="1"/>
+          <w:color w:val="000000"/>
+          <w:sz w:val="22"/>
+          <w:szCs w:val="22"/>
+          <w:rtl w:val="0"/>
+        </w:rPr>
+        <w:t xml:space="preserve">document_id</w:t>
+      </w:r>
+      <w:r>
+        <w:rPr>
+          <w:rFonts w:ascii="Cambria" w:cs="Cambria" w:eastAsia="Cambria" w:hAnsi="Cambria"/>
+          <w:color w:val="000000"/>
+          <w:sz w:val="22"/>
+          <w:szCs w:val="22"/>
+          <w:rtl w:val="0"/>
+        </w:rPr>
+        <w:t xml:space="preserve">, hệ thống sẽ gán Recall và Precision bằng 0 cho câu hỏi đó.</w:t>
+      </w:r>
+    </w:p>
+    <w:p>
+      <w:pPr>
+        <w:spacing w:after="240" w:before="240" w:line="240" w:lineRule="auto"/>
+        <w:rPr>
+          <w:rFonts w:ascii="Cambria" w:cs="Cambria" w:eastAsia="Cambria" w:hAnsi="Cambria"/>
+          <w:color w:val="000000"/>
+          <w:sz w:val="22"/>
+          <w:szCs w:val="22"/>
+        </w:rPr>
+      </w:pPr>
+      <w:r>
+        <w:rPr>
+          <w:rFonts w:ascii="Cambria" w:cs="Cambria" w:eastAsia="Cambria" w:hAnsi="Cambria"/>
+          <w:color w:val="000000"/>
+          <w:sz w:val="22"/>
+          <w:szCs w:val="22"/>
+          <w:rtl w:val="0"/>
+        </w:rPr>
+        <w:t xml:space="preserve">Điểm Recall và Precision của toàn bộ bài nộp được tính bằng </w:t>
+      </w:r>
+      <w:r>
+        <w:rPr>
+          <w:rFonts w:ascii="Cambria" w:cs="Cambria" w:eastAsia="Cambria" w:hAnsi="Cambria"/>
+          <w:b w:val="1"/>
+          <w:bCs w:val="1"/>
+          <w:color w:val="000000"/>
+          <w:sz w:val="22"/>
+          <w:szCs w:val="22"/>
+          <w:rtl w:val="0"/>
+        </w:rPr>
+        <w:t xml:space="preserve">trung bình trên tất cả các câu hỏi </w:t>
+      </w:r>
+      <w:r>
+        <w:rPr>
+          <w:rFonts w:ascii="Cambria" w:cs="Cambria" w:eastAsia="Cambria" w:hAnsi="Cambria"/>
+          <w:color w:val="000000"/>
+          <w:sz w:val="22"/>
+          <w:szCs w:val="22"/>
+          <w:rtl w:val="0"/>
+        </w:rPr>
+        <w:t xml:space="preserve">theo công thức ở mục 4</w:t>
+      </w:r>
+      <w:r>
+        <w:rPr>
+          <w:rFonts w:ascii="Cambria" w:cs="Cambria" w:eastAsia="Cambria" w:hAnsi="Cambria"/>
+          <w:color w:val="000000"/>
+          <w:sz w:val="22"/>
+          <w:szCs w:val="22"/>
+          <w:rtl w:val="0"/>
+        </w:rPr>
+        <w:t xml:space="preserve">, bao gồm cả các câu hỏi vi phạm ràng buộc trên.</w:t>
+      </w:r>
+    </w:p>
+    <w:p>
+      <w:pPr>
+        <w:spacing w:line="240" w:lineRule="auto"/>
+        <w:rPr>
+          <w:rFonts w:ascii="Cambria" w:cs="Cambria" w:eastAsia="Cambria" w:hAnsi="Cambria"/>
+          <w:color w:val="000000"/>
+          <w:sz w:val="22"/>
+          <w:szCs w:val="22"/>
+        </w:rPr>
+      </w:pPr>
       <w:r>
         <w:rPr>
           <w:rtl w:val="0"/>

</xml_diff>